<commit_message>
Week 1 project, second edit. Replaced sample document with actual assignment. Condensed pages.
</commit_message>
<xml_diff>
--- a/NateLawonn_ProgrammingExercise_1.docx
+++ b/NateLawonn_ProgrammingExercise_1.docx
@@ -4,136 +4,125 @@
   <w:body>
     <w:p>
       <w:pPr>
-        <w:pStyle w:val="Heading1"/>
-      </w:pPr>
-      <w:r>
-        <w:t>Template:</w:t>
-      </w:r>
-    </w:p>
-    <w:p>
-      <w:pPr>
-        <w:rPr>
-          <w:sz w:val="24"/>
-          <w:szCs w:val="24"/>
-        </w:rPr>
-      </w:pPr>
-    </w:p>
-    <w:p>
-      <w:pPr>
-        <w:rPr>
-          <w:sz w:val="24"/>
-          <w:szCs w:val="24"/>
-        </w:rPr>
-      </w:pPr>
-      <w:r>
-        <w:rPr>
-          <w:sz w:val="24"/>
-          <w:szCs w:val="24"/>
-        </w:rPr>
-        <w:t># Technical Design Document: example_docstring</w:t>
-      </w:r>
-    </w:p>
-    <w:p>
-      <w:pPr>
-        <w:rPr>
-          <w:sz w:val="24"/>
-          <w:szCs w:val="24"/>
-        </w:rPr>
-      </w:pPr>
-    </w:p>
-    <w:p>
-      <w:pPr>
-        <w:rPr>
-          <w:sz w:val="24"/>
-          <w:szCs w:val="24"/>
-        </w:rPr>
-      </w:pPr>
-      <w:r>
-        <w:rPr>
-          <w:sz w:val="24"/>
-          <w:szCs w:val="24"/>
-        </w:rPr>
-        <w:t># Name: Susan Melichar</w:t>
-      </w:r>
-    </w:p>
-    <w:p>
-      <w:pPr>
-        <w:rPr>
-          <w:sz w:val="24"/>
-          <w:szCs w:val="24"/>
-        </w:rPr>
-      </w:pPr>
-      <w:r>
-        <w:rPr>
-          <w:sz w:val="24"/>
-          <w:szCs w:val="24"/>
-        </w:rPr>
-        <w:t># Date: November 12, 2025</w:t>
-      </w:r>
-    </w:p>
-    <w:p>
-      <w:pPr>
-        <w:rPr>
-          <w:sz w:val="24"/>
-          <w:szCs w:val="24"/>
-        </w:rPr>
-      </w:pPr>
-      <w:r>
-        <w:rPr>
-          <w:sz w:val="24"/>
-          <w:szCs w:val="24"/>
-        </w:rPr>
-        <w:t># Program Description: Give brief description of your program</w:t>
-      </w:r>
-    </w:p>
-    <w:p>
-      <w:pPr>
-        <w:rPr>
-          <w:sz w:val="24"/>
-          <w:szCs w:val="24"/>
-        </w:rPr>
-      </w:pPr>
-    </w:p>
-    <w:p>
-      <w:pPr>
-        <w:rPr>
-          <w:sz w:val="24"/>
-          <w:szCs w:val="24"/>
-        </w:rPr>
-      </w:pPr>
-      <w:r>
-        <w:rPr>
-          <w:sz w:val="24"/>
-          <w:szCs w:val="24"/>
-        </w:rPr>
-        <w:t>## Function: display_total_sales</w:t>
-      </w:r>
-    </w:p>
-    <w:p>
-      <w:pPr>
-        <w:rPr>
-          <w:sz w:val="24"/>
-          <w:szCs w:val="24"/>
-        </w:rPr>
-      </w:pPr>
-      <w:r>
-        <w:rPr>
-          <w:sz w:val="24"/>
-          <w:szCs w:val="24"/>
-        </w:rPr>
-        <w:t>Calls the function that reads and totals sales, then displays the result.</w:t>
-      </w:r>
-    </w:p>
-    <w:p>
-      <w:pPr>
-        <w:rPr>
-          <w:sz w:val="24"/>
-          <w:szCs w:val="24"/>
-        </w:rPr>
-      </w:pPr>
-    </w:p>
-    <w:p>
-      <w:pPr>
+        <w:rPr>
+          <w:sz w:val="24"/>
+          <w:szCs w:val="24"/>
+        </w:rPr>
+      </w:pPr>
+      <w:r>
+        <w:rPr>
+          <w:sz w:val="24"/>
+          <w:szCs w:val="24"/>
+        </w:rPr>
+        <w:t xml:space="preserve"># Name: </w:t>
+      </w:r>
+      <w:r>
+        <w:rPr>
+          <w:sz w:val="24"/>
+          <w:szCs w:val="24"/>
+        </w:rPr>
+        <w:t>Nate Lawonn</w:t>
+      </w:r>
+    </w:p>
+    <w:p>
+      <w:pPr>
+        <w:rPr>
+          <w:sz w:val="24"/>
+          <w:szCs w:val="24"/>
+        </w:rPr>
+      </w:pPr>
+      <w:r>
+        <w:rPr>
+          <w:sz w:val="24"/>
+          <w:szCs w:val="24"/>
+        </w:rPr>
+        <w:t xml:space="preserve"># Date: </w:t>
+      </w:r>
+      <w:r>
+        <w:rPr>
+          <w:sz w:val="24"/>
+          <w:szCs w:val="24"/>
+        </w:rPr>
+        <w:t>May 19, 2026</w:t>
+      </w:r>
+    </w:p>
+    <w:p>
+      <w:pPr>
+        <w:rPr>
+          <w:sz w:val="24"/>
+          <w:szCs w:val="24"/>
+        </w:rPr>
+      </w:pPr>
+      <w:r>
+        <w:rPr>
+          <w:sz w:val="24"/>
+          <w:szCs w:val="24"/>
+        </w:rPr>
+        <w:t xml:space="preserve"># Program Description: </w:t>
+      </w:r>
+      <w:r>
+        <w:rPr>
+          <w:sz w:val="24"/>
+          <w:szCs w:val="24"/>
+        </w:rPr>
+        <w:t>A movie theater box office program that manages the pre-sale of 20 movie tickets. It loops through user input transactions, limiting buyers to a maximum of 4 tickets per transaction, tracks the remaining inventory and reports the total number of successful buyers upon sell out.</w:t>
+      </w:r>
+    </w:p>
+    <w:p>
+      <w:pPr>
+        <w:spacing w:after="0"/>
+        <w:rPr>
+          <w:sz w:val="24"/>
+          <w:szCs w:val="24"/>
+        </w:rPr>
+      </w:pPr>
+      <w:r>
+        <w:rPr>
+          <w:sz w:val="24"/>
+          <w:szCs w:val="24"/>
+        </w:rPr>
+        <w:t>## Function</w:t>
+      </w:r>
+      <w:r>
+        <w:rPr>
+          <w:sz w:val="24"/>
+          <w:szCs w:val="24"/>
+        </w:rPr>
+        <w:t>: main</w:t>
+      </w:r>
+    </w:p>
+    <w:p>
+      <w:pPr>
+        <w:rPr>
+          <w:sz w:val="24"/>
+          <w:szCs w:val="24"/>
+        </w:rPr>
+      </w:pPr>
+      <w:r>
+        <w:rPr>
+          <w:sz w:val="24"/>
+          <w:szCs w:val="24"/>
+        </w:rPr>
+        <w:t xml:space="preserve">Acts as the central controller for the movie theater box office program. It holds the loop structure, prompts the user for number of </w:t>
+      </w:r>
+      <w:r>
+        <w:rPr>
+          <w:sz w:val="24"/>
+          <w:szCs w:val="24"/>
+        </w:rPr>
+        <w:t>tickets,</w:t>
+      </w:r>
+      <w:r>
+        <w:rPr>
+          <w:sz w:val="24"/>
+          <w:szCs w:val="24"/>
+        </w:rPr>
+        <w:t xml:space="preserve"> and prints the number of buyers when all the tickets have been sold.</w:t>
+      </w:r>
+    </w:p>
+    <w:p>
+      <w:pPr>
+        <w:spacing w:after="0"/>
         <w:rPr>
           <w:sz w:val="24"/>
           <w:szCs w:val="24"/>
@@ -159,19 +148,12 @@
           <w:sz w:val="24"/>
           <w:szCs w:val="24"/>
         </w:rPr>
-        <w:t xml:space="preserve">    None</w:t>
-      </w:r>
-    </w:p>
-    <w:p>
-      <w:pPr>
-        <w:rPr>
-          <w:sz w:val="24"/>
-          <w:szCs w:val="24"/>
-        </w:rPr>
-      </w:pPr>
-    </w:p>
-    <w:p>
-      <w:pPr>
+        <w:t>None</w:t>
+      </w:r>
+    </w:p>
+    <w:p>
+      <w:pPr>
+        <w:spacing w:after="0"/>
         <w:rPr>
           <w:sz w:val="24"/>
           <w:szCs w:val="24"/>
@@ -187,36 +169,76 @@
     </w:p>
     <w:p>
       <w:pPr>
-        <w:rPr>
-          <w:sz w:val="24"/>
-          <w:szCs w:val="24"/>
-        </w:rPr>
-      </w:pPr>
-      <w:r>
-        <w:rPr>
-          <w:sz w:val="24"/>
-          <w:szCs w:val="24"/>
-        </w:rPr>
-        <w:t xml:space="preserve">    total_sales (float): The total sales amount returned from</w:t>
-      </w:r>
-    </w:p>
-    <w:p>
-      <w:pPr>
-        <w:rPr>
-          <w:sz w:val="24"/>
-          <w:szCs w:val="24"/>
-        </w:rPr>
-      </w:pPr>
-      <w:r>
-        <w:rPr>
-          <w:sz w:val="24"/>
-          <w:szCs w:val="24"/>
-        </w:rPr>
-        <w:t xml:space="preserve">                         the read_sales_and_total function.</w:t>
-      </w:r>
-    </w:p>
-    <w:p>
-      <w:pPr>
+        <w:spacing w:after="0"/>
+        <w:rPr>
+          <w:sz w:val="24"/>
+          <w:szCs w:val="24"/>
+        </w:rPr>
+      </w:pPr>
+      <w:r>
+        <w:rPr>
+          <w:sz w:val="24"/>
+          <w:szCs w:val="24"/>
+        </w:rPr>
+        <w:t>remaining</w:t>
+      </w:r>
+      <w:r>
+        <w:rPr>
+          <w:sz w:val="24"/>
+          <w:szCs w:val="24"/>
+        </w:rPr>
+        <w:t>_tickets (int): total tickets available for sale, starting at 20.</w:t>
+      </w:r>
+    </w:p>
+    <w:p>
+      <w:pPr>
+        <w:spacing w:after="0"/>
+        <w:rPr>
+          <w:sz w:val="24"/>
+          <w:szCs w:val="24"/>
+        </w:rPr>
+      </w:pPr>
+      <w:r>
+        <w:rPr>
+          <w:sz w:val="24"/>
+          <w:szCs w:val="24"/>
+        </w:rPr>
+        <w:t>total</w:t>
+      </w:r>
+      <w:r>
+        <w:rPr>
+          <w:sz w:val="24"/>
+          <w:szCs w:val="24"/>
+        </w:rPr>
+        <w:t>_buyers (int): Accumulator that tracks total valid transactions.</w:t>
+      </w:r>
+    </w:p>
+    <w:p>
+      <w:pPr>
+        <w:spacing w:after="0"/>
+        <w:rPr>
+          <w:sz w:val="24"/>
+          <w:szCs w:val="24"/>
+        </w:rPr>
+      </w:pPr>
+      <w:r>
+        <w:rPr>
+          <w:sz w:val="24"/>
+          <w:szCs w:val="24"/>
+        </w:rPr>
+        <w:t>was</w:t>
+      </w:r>
+      <w:r>
+        <w:rPr>
+          <w:sz w:val="24"/>
+          <w:szCs w:val="24"/>
+        </w:rPr>
+        <w:t>_successful (bool): transaction success state sent back from the processor function.</w:t>
+      </w:r>
+    </w:p>
+    <w:p>
+      <w:pPr>
+        <w:spacing w:after="0"/>
         <w:rPr>
           <w:sz w:val="24"/>
           <w:szCs w:val="24"/>
@@ -240,372 +262,408 @@
     </w:p>
     <w:p>
       <w:pPr>
+        <w:pStyle w:val="ListParagraph"/>
         <w:numPr>
           <w:ilvl w:val="0"/>
-          <w:numId w:val="10"/>
+          <w:numId w:val="11"/>
         </w:numPr>
-        <w:rPr>
-          <w:sz w:val="24"/>
-          <w:szCs w:val="24"/>
-        </w:rPr>
-      </w:pPr>
-      <w:r>
-        <w:rPr>
-          <w:sz w:val="24"/>
-          <w:szCs w:val="24"/>
-        </w:rPr>
-        <w:t>Call the read_sales_and_total function.</w:t>
-      </w:r>
-    </w:p>
-    <w:p>
-      <w:pPr>
+        <w:spacing w:after="0"/>
+        <w:rPr>
+          <w:sz w:val="24"/>
+          <w:szCs w:val="24"/>
+        </w:rPr>
+      </w:pPr>
+      <w:r>
+        <w:rPr>
+          <w:sz w:val="24"/>
+          <w:szCs w:val="24"/>
+        </w:rPr>
+        <w:t>Initialize remaining_tickets to 20 and total_buyers to 0.</w:t>
+      </w:r>
+    </w:p>
+    <w:p>
+      <w:pPr>
+        <w:pStyle w:val="ListParagraph"/>
         <w:numPr>
           <w:ilvl w:val="0"/>
-          <w:numId w:val="10"/>
+          <w:numId w:val="11"/>
         </w:numPr>
-        <w:rPr>
-          <w:sz w:val="24"/>
-          <w:szCs w:val="24"/>
-        </w:rPr>
-      </w:pPr>
-      <w:r>
-        <w:rPr>
-          <w:sz w:val="24"/>
-          <w:szCs w:val="24"/>
-        </w:rPr>
-        <w:t>Store the returned value in total_sales.</w:t>
-      </w:r>
-    </w:p>
-    <w:p>
-      <w:pPr>
+        <w:spacing w:after="0"/>
+        <w:rPr>
+          <w:sz w:val="24"/>
+          <w:szCs w:val="24"/>
+        </w:rPr>
+      </w:pPr>
+      <w:r>
+        <w:rPr>
+          <w:sz w:val="24"/>
+          <w:szCs w:val="24"/>
+        </w:rPr>
+        <w:t>While remaining_tickets is greater than 0, prompt the user for ticket amount inputs.</w:t>
+      </w:r>
+    </w:p>
+    <w:p>
+      <w:pPr>
+        <w:pStyle w:val="ListParagraph"/>
         <w:numPr>
           <w:ilvl w:val="0"/>
-          <w:numId w:val="10"/>
+          <w:numId w:val="11"/>
         </w:numPr>
-        <w:rPr>
-          <w:sz w:val="24"/>
-          <w:szCs w:val="24"/>
-        </w:rPr>
-      </w:pPr>
-      <w:r>
-        <w:rPr>
-          <w:sz w:val="24"/>
-          <w:szCs w:val="24"/>
-        </w:rPr>
-        <w:t>Display the total sales to the user.</w:t>
-      </w:r>
-    </w:p>
-    <w:p>
-      <w:pPr>
-        <w:rPr>
-          <w:sz w:val="24"/>
-          <w:szCs w:val="24"/>
-        </w:rPr>
-      </w:pPr>
-    </w:p>
-    <w:p>
-      <w:pPr>
-        <w:rPr>
-          <w:sz w:val="24"/>
-          <w:szCs w:val="24"/>
-        </w:rPr>
-      </w:pPr>
-      <w:r>
-        <w:rPr>
-          <w:sz w:val="24"/>
-          <w:szCs w:val="24"/>
-        </w:rPr>
-        <w:t>Return:</w:t>
-      </w:r>
-    </w:p>
-    <w:p>
-      <w:pPr>
-        <w:rPr>
-          <w:sz w:val="24"/>
-          <w:szCs w:val="24"/>
-        </w:rPr>
-      </w:pPr>
-      <w:r>
-        <w:rPr>
-          <w:sz w:val="24"/>
-          <w:szCs w:val="24"/>
-        </w:rPr>
-        <w:t xml:space="preserve">    None</w:t>
-      </w:r>
-    </w:p>
-    <w:p>
-      <w:pPr>
-        <w:rPr>
-          <w:sz w:val="24"/>
-          <w:szCs w:val="24"/>
-        </w:rPr>
-      </w:pPr>
-    </w:p>
-    <w:p>
-      <w:pPr>
-        <w:rPr>
-          <w:sz w:val="24"/>
-          <w:szCs w:val="24"/>
-        </w:rPr>
-      </w:pPr>
-      <w:r>
-        <w:rPr>
-          <w:sz w:val="24"/>
-          <w:szCs w:val="24"/>
-        </w:rPr>
-        <w:t>## Function: read_sales_and_total</w:t>
-      </w:r>
-    </w:p>
-    <w:p>
-      <w:pPr>
-        <w:rPr>
-          <w:sz w:val="24"/>
-          <w:szCs w:val="24"/>
-        </w:rPr>
-      </w:pPr>
-      <w:r>
-        <w:rPr>
-          <w:sz w:val="24"/>
-          <w:szCs w:val="24"/>
-        </w:rPr>
-        <w:t>Reads sales amounts from a file and calculates the total sales.</w:t>
-      </w:r>
-    </w:p>
-    <w:p>
-      <w:pPr>
-        <w:rPr>
-          <w:sz w:val="24"/>
-          <w:szCs w:val="24"/>
-        </w:rPr>
-      </w:pPr>
-    </w:p>
-    <w:p>
-      <w:pPr>
-        <w:rPr>
-          <w:sz w:val="24"/>
-          <w:szCs w:val="24"/>
-        </w:rPr>
-      </w:pPr>
-      <w:r>
-        <w:rPr>
-          <w:sz w:val="24"/>
-          <w:szCs w:val="24"/>
-        </w:rPr>
-        <w:lastRenderedPageBreak/>
-        <w:t>Parameters:</w:t>
-      </w:r>
-    </w:p>
-    <w:p>
-      <w:pPr>
-        <w:rPr>
-          <w:sz w:val="24"/>
-          <w:szCs w:val="24"/>
-        </w:rPr>
-      </w:pPr>
-      <w:r>
-        <w:rPr>
-          <w:sz w:val="24"/>
-          <w:szCs w:val="24"/>
-        </w:rPr>
-        <w:t xml:space="preserve">    filename (str): The name of the file containing sales data.</w:t>
-      </w:r>
-    </w:p>
-    <w:p>
-      <w:pPr>
-        <w:rPr>
-          <w:sz w:val="24"/>
-          <w:szCs w:val="24"/>
-        </w:rPr>
-      </w:pPr>
-    </w:p>
-    <w:p>
-      <w:pPr>
-        <w:rPr>
-          <w:sz w:val="24"/>
-          <w:szCs w:val="24"/>
-        </w:rPr>
-      </w:pPr>
-      <w:r>
-        <w:rPr>
-          <w:sz w:val="24"/>
-          <w:szCs w:val="24"/>
-        </w:rPr>
-        <w:t>Variables:</w:t>
-      </w:r>
-    </w:p>
-    <w:p>
-      <w:pPr>
-        <w:rPr>
-          <w:sz w:val="24"/>
-          <w:szCs w:val="24"/>
-        </w:rPr>
-      </w:pPr>
-      <w:r>
-        <w:rPr>
-          <w:sz w:val="24"/>
-          <w:szCs w:val="24"/>
-        </w:rPr>
-        <w:t xml:space="preserve">    file (TextIO): File object used to read data from the file.</w:t>
-      </w:r>
-    </w:p>
-    <w:p>
-      <w:pPr>
-        <w:rPr>
-          <w:sz w:val="24"/>
-          <w:szCs w:val="24"/>
-        </w:rPr>
-      </w:pPr>
-      <w:r>
-        <w:rPr>
-          <w:sz w:val="24"/>
-          <w:szCs w:val="24"/>
-        </w:rPr>
-        <w:t xml:space="preserve">    total (float): Accumulator used to store the total sales amount.</w:t>
-      </w:r>
-    </w:p>
-    <w:p>
-      <w:pPr>
-        <w:rPr>
-          <w:sz w:val="24"/>
-          <w:szCs w:val="24"/>
-        </w:rPr>
-      </w:pPr>
-      <w:r>
-        <w:rPr>
-          <w:sz w:val="24"/>
-          <w:szCs w:val="24"/>
-        </w:rPr>
-        <w:t xml:space="preserve">    line (str): Each line read from the file representing a sale.</w:t>
-      </w:r>
-    </w:p>
-    <w:p>
-      <w:pPr>
-        <w:rPr>
-          <w:sz w:val="24"/>
-          <w:szCs w:val="24"/>
-        </w:rPr>
-      </w:pPr>
-    </w:p>
-    <w:p>
-      <w:pPr>
-        <w:rPr>
-          <w:sz w:val="24"/>
-          <w:szCs w:val="24"/>
-        </w:rPr>
-      </w:pPr>
-      <w:r>
-        <w:rPr>
-          <w:sz w:val="24"/>
-          <w:szCs w:val="24"/>
-        </w:rPr>
-        <w:t>Logic:</w:t>
-      </w:r>
-    </w:p>
-    <w:p>
-      <w:pPr>
+        <w:spacing w:after="0"/>
+        <w:rPr>
+          <w:sz w:val="24"/>
+          <w:szCs w:val="24"/>
+        </w:rPr>
+      </w:pPr>
+      <w:r>
+        <w:rPr>
+          <w:sz w:val="24"/>
+          <w:szCs w:val="24"/>
+        </w:rPr>
+        <w:t>Call process_purchase using the requested tickets and current inventory.</w:t>
+      </w:r>
+    </w:p>
+    <w:p>
+      <w:pPr>
+        <w:pStyle w:val="ListParagraph"/>
         <w:numPr>
           <w:ilvl w:val="0"/>
-          <w:numId w:val="8"/>
+          <w:numId w:val="11"/>
         </w:numPr>
-        <w:rPr>
-          <w:sz w:val="24"/>
-          <w:szCs w:val="24"/>
-        </w:rPr>
-      </w:pPr>
-      <w:r>
-        <w:rPr>
-          <w:sz w:val="24"/>
-          <w:szCs w:val="24"/>
-        </w:rPr>
-        <w:t>Open the file in read mode.</w:t>
-      </w:r>
-    </w:p>
-    <w:p>
-      <w:pPr>
+        <w:spacing w:after="0"/>
+        <w:rPr>
+          <w:sz w:val="24"/>
+          <w:szCs w:val="24"/>
+        </w:rPr>
+      </w:pPr>
+      <w:r>
+        <w:rPr>
+          <w:sz w:val="24"/>
+          <w:szCs w:val="24"/>
+        </w:rPr>
+        <w:t>If was_successful returns True, increment total_buyers by 1 and print remaining tickets.</w:t>
+      </w:r>
+    </w:p>
+    <w:p>
+      <w:pPr>
+        <w:pStyle w:val="ListParagraph"/>
         <w:numPr>
           <w:ilvl w:val="0"/>
-          <w:numId w:val="8"/>
+          <w:numId w:val="11"/>
         </w:numPr>
-        <w:rPr>
-          <w:sz w:val="24"/>
-          <w:szCs w:val="24"/>
-        </w:rPr>
-      </w:pPr>
-      <w:r>
-        <w:rPr>
-          <w:sz w:val="24"/>
-          <w:szCs w:val="24"/>
-        </w:rPr>
-        <w:t>Initialize total to 0.0.</w:t>
-      </w:r>
-    </w:p>
-    <w:p>
-      <w:pPr>
+        <w:spacing w:after="0"/>
+        <w:rPr>
+          <w:sz w:val="24"/>
+          <w:szCs w:val="24"/>
+        </w:rPr>
+      </w:pPr>
+      <w:r>
+        <w:rPr>
+          <w:sz w:val="24"/>
+          <w:szCs w:val="24"/>
+        </w:rPr>
+        <w:t>Once out of the loop, display the final total_buyers count.</w:t>
+      </w:r>
+    </w:p>
+    <w:p>
+      <w:pPr>
+        <w:spacing w:after="0"/>
+        <w:rPr>
+          <w:sz w:val="24"/>
+          <w:szCs w:val="24"/>
+        </w:rPr>
+      </w:pPr>
+    </w:p>
+    <w:p>
+      <w:pPr>
+        <w:spacing w:after="0"/>
+        <w:rPr>
+          <w:sz w:val="24"/>
+          <w:szCs w:val="24"/>
+        </w:rPr>
+      </w:pPr>
+      <w:r>
+        <w:rPr>
+          <w:sz w:val="24"/>
+          <w:szCs w:val="24"/>
+        </w:rPr>
+        <w:t>Return:</w:t>
+      </w:r>
+    </w:p>
+    <w:p>
+      <w:pPr>
+        <w:spacing w:after="0"/>
+        <w:rPr>
+          <w:sz w:val="24"/>
+          <w:szCs w:val="24"/>
+        </w:rPr>
+      </w:pPr>
+      <w:r>
+        <w:rPr>
+          <w:sz w:val="24"/>
+          <w:szCs w:val="24"/>
+        </w:rPr>
+        <w:t>None</w:t>
+      </w:r>
+    </w:p>
+    <w:p>
+      <w:pPr>
+        <w:spacing w:after="0"/>
+        <w:rPr>
+          <w:sz w:val="24"/>
+          <w:szCs w:val="24"/>
+        </w:rPr>
+      </w:pPr>
+    </w:p>
+    <w:p>
+      <w:pPr>
+        <w:spacing w:after="0"/>
+        <w:rPr>
+          <w:sz w:val="24"/>
+          <w:szCs w:val="24"/>
+        </w:rPr>
+      </w:pPr>
+      <w:r>
+        <w:rPr>
+          <w:sz w:val="24"/>
+          <w:szCs w:val="24"/>
+        </w:rPr>
+        <w:t>## Function</w:t>
+      </w:r>
+      <w:r>
+        <w:rPr>
+          <w:sz w:val="24"/>
+          <w:szCs w:val="24"/>
+        </w:rPr>
+        <w:t>: process_purchase</w:t>
+      </w:r>
+    </w:p>
+    <w:p>
+      <w:pPr>
+        <w:spacing w:after="0"/>
+        <w:rPr>
+          <w:sz w:val="24"/>
+          <w:szCs w:val="24"/>
+        </w:rPr>
+      </w:pPr>
+      <w:r>
+        <w:rPr>
+          <w:sz w:val="24"/>
+          <w:szCs w:val="24"/>
+        </w:rPr>
+        <w:t>Validates and handles individual ticket orders against sales rules and current inventory.</w:t>
+      </w:r>
+    </w:p>
+    <w:p>
+      <w:pPr>
+        <w:spacing w:after="0"/>
+        <w:rPr>
+          <w:sz w:val="24"/>
+          <w:szCs w:val="24"/>
+        </w:rPr>
+      </w:pPr>
+    </w:p>
+    <w:p>
+      <w:pPr>
+        <w:spacing w:after="0"/>
+        <w:rPr>
+          <w:sz w:val="24"/>
+          <w:szCs w:val="24"/>
+        </w:rPr>
+      </w:pPr>
+      <w:r>
+        <w:rPr>
+          <w:sz w:val="24"/>
+          <w:szCs w:val="24"/>
+        </w:rPr>
+        <w:t>Parameters:</w:t>
+      </w:r>
+    </w:p>
+    <w:p>
+      <w:pPr>
+        <w:spacing w:after="0"/>
+        <w:rPr>
+          <w:sz w:val="24"/>
+          <w:szCs w:val="24"/>
+        </w:rPr>
+      </w:pPr>
+      <w:r>
+        <w:rPr>
+          <w:sz w:val="24"/>
+          <w:szCs w:val="24"/>
+        </w:rPr>
+        <w:t>requested</w:t>
+      </w:r>
+      <w:r>
+        <w:rPr>
+          <w:sz w:val="24"/>
+          <w:szCs w:val="24"/>
+        </w:rPr>
+        <w:t>_tickets (int): the number of tickets the user wants.</w:t>
+      </w:r>
+    </w:p>
+    <w:p>
+      <w:pPr>
+        <w:spacing w:after="0"/>
+        <w:rPr>
+          <w:sz w:val="24"/>
+          <w:szCs w:val="24"/>
+        </w:rPr>
+      </w:pPr>
+      <w:r>
+        <w:rPr>
+          <w:sz w:val="24"/>
+          <w:szCs w:val="24"/>
+        </w:rPr>
+        <w:t>current</w:t>
+      </w:r>
+      <w:r>
+        <w:rPr>
+          <w:sz w:val="24"/>
+          <w:szCs w:val="24"/>
+        </w:rPr>
+        <w:t>_remaining (int):</w:t>
+      </w:r>
+      <w:r>
+        <w:rPr>
+          <w:sz w:val="24"/>
+          <w:szCs w:val="24"/>
+        </w:rPr>
+        <w:t xml:space="preserve"> the current balance of tickets left.</w:t>
+      </w:r>
+    </w:p>
+    <w:p>
+      <w:pPr>
+        <w:spacing w:after="0"/>
+        <w:rPr>
+          <w:sz w:val="24"/>
+          <w:szCs w:val="24"/>
+        </w:rPr>
+      </w:pPr>
+    </w:p>
+    <w:p>
+      <w:pPr>
+        <w:spacing w:after="0"/>
+        <w:rPr>
+          <w:sz w:val="24"/>
+          <w:szCs w:val="24"/>
+        </w:rPr>
+      </w:pPr>
+      <w:r>
+        <w:rPr>
+          <w:sz w:val="24"/>
+          <w:szCs w:val="24"/>
+        </w:rPr>
+        <w:t>Variables:</w:t>
+      </w:r>
+    </w:p>
+    <w:p>
+      <w:pPr>
+        <w:spacing w:after="0"/>
+        <w:rPr>
+          <w:sz w:val="24"/>
+          <w:szCs w:val="24"/>
+        </w:rPr>
+      </w:pPr>
+      <w:r>
+        <w:rPr>
+          <w:sz w:val="24"/>
+          <w:szCs w:val="24"/>
+        </w:rPr>
+        <w:t>None</w:t>
+      </w:r>
+    </w:p>
+    <w:p>
+      <w:pPr>
+        <w:rPr>
+          <w:sz w:val="24"/>
+          <w:szCs w:val="24"/>
+        </w:rPr>
+      </w:pPr>
+    </w:p>
+    <w:p>
+      <w:pPr>
+        <w:spacing w:after="0"/>
+        <w:rPr>
+          <w:sz w:val="24"/>
+          <w:szCs w:val="24"/>
+        </w:rPr>
+      </w:pPr>
+      <w:r>
+        <w:rPr>
+          <w:sz w:val="24"/>
+          <w:szCs w:val="24"/>
+        </w:rPr>
+        <w:t>Logic:</w:t>
+      </w:r>
+    </w:p>
+    <w:p>
+      <w:pPr>
+        <w:pStyle w:val="ListParagraph"/>
         <w:numPr>
           <w:ilvl w:val="0"/>
-          <w:numId w:val="8"/>
+          <w:numId w:val="12"/>
         </w:numPr>
-        <w:rPr>
-          <w:sz w:val="24"/>
-          <w:szCs w:val="24"/>
-        </w:rPr>
-      </w:pPr>
-      <w:r>
-        <w:rPr>
-          <w:sz w:val="24"/>
-          <w:szCs w:val="24"/>
-        </w:rPr>
-        <w:t>Loop through each line in the file.</w:t>
-      </w:r>
-    </w:p>
-    <w:p>
-      <w:pPr>
+        <w:spacing w:after="0"/>
+        <w:rPr>
+          <w:sz w:val="24"/>
+          <w:szCs w:val="24"/>
+        </w:rPr>
+      </w:pPr>
+      <w:r>
+        <w:rPr>
+          <w:sz w:val="24"/>
+          <w:szCs w:val="24"/>
+        </w:rPr>
+        <w:t>If requested_tickets is greater than 4, display an error message and return the unchanged inventory and False.</w:t>
+      </w:r>
+    </w:p>
+    <w:p>
+      <w:pPr>
+        <w:pStyle w:val="ListParagraph"/>
         <w:numPr>
           <w:ilvl w:val="0"/>
-          <w:numId w:val="8"/>
+          <w:numId w:val="12"/>
         </w:numPr>
-        <w:rPr>
-          <w:sz w:val="24"/>
-          <w:szCs w:val="24"/>
-        </w:rPr>
-      </w:pPr>
-      <w:r>
-        <w:rPr>
-          <w:sz w:val="24"/>
-          <w:szCs w:val="24"/>
-        </w:rPr>
-        <w:t>Convert the line to a float and add it to total.</w:t>
-      </w:r>
-    </w:p>
-    <w:p>
-      <w:pPr>
+        <w:spacing w:after="0"/>
+        <w:rPr>
+          <w:sz w:val="24"/>
+          <w:szCs w:val="24"/>
+        </w:rPr>
+      </w:pPr>
+      <w:r>
+        <w:rPr>
+          <w:sz w:val="24"/>
+          <w:szCs w:val="24"/>
+        </w:rPr>
+        <w:lastRenderedPageBreak/>
+        <w:t>If requested_tickets is greater than current_remaining, print an inventory error message and return the unchanged inventory and False.</w:t>
+      </w:r>
+    </w:p>
+    <w:p>
+      <w:pPr>
+        <w:pStyle w:val="ListParagraph"/>
         <w:numPr>
           <w:ilvl w:val="0"/>
-          <w:numId w:val="8"/>
+          <w:numId w:val="12"/>
         </w:numPr>
-        <w:rPr>
-          <w:sz w:val="24"/>
-          <w:szCs w:val="24"/>
-        </w:rPr>
-      </w:pPr>
-      <w:r>
-        <w:rPr>
-          <w:sz w:val="24"/>
-          <w:szCs w:val="24"/>
-        </w:rPr>
-        <w:t>Return the total sales amount.</w:t>
-      </w:r>
-    </w:p>
-    <w:p>
-      <w:pPr>
-        <w:rPr>
-          <w:sz w:val="24"/>
-          <w:szCs w:val="24"/>
-        </w:rPr>
-      </w:pPr>
-    </w:p>
-    <w:p>
-      <w:pPr>
+        <w:spacing w:after="0"/>
+        <w:rPr>
+          <w:sz w:val="24"/>
+          <w:szCs w:val="24"/>
+        </w:rPr>
+      </w:pPr>
+      <w:r>
+        <w:rPr>
+          <w:sz w:val="24"/>
+          <w:szCs w:val="24"/>
+        </w:rPr>
+        <w:t>Otherwise, subtract requested_tickets from current_remaining and return the new balance along with True.</w:t>
+      </w:r>
+    </w:p>
+    <w:p>
+      <w:pPr>
+        <w:spacing w:after="0"/>
         <w:rPr>
           <w:sz w:val="24"/>
           <w:szCs w:val="24"/>
@@ -621,311 +679,39 @@
     </w:p>
     <w:p>
       <w:pPr>
-        <w:rPr>
-          <w:sz w:val="24"/>
-          <w:szCs w:val="24"/>
-        </w:rPr>
-      </w:pPr>
-      <w:r>
-        <w:rPr>
-          <w:sz w:val="24"/>
-          <w:szCs w:val="24"/>
-        </w:rPr>
-        <w:t xml:space="preserve">    float: The total of all sales read from the file.</w:t>
-      </w:r>
-    </w:p>
-    <w:p>
-      <w:pPr>
-        <w:rPr>
-          <w:sz w:val="24"/>
-          <w:szCs w:val="24"/>
-        </w:rPr>
-      </w:pPr>
-    </w:p>
-    <w:p>
-      <w:pPr>
-        <w:rPr>
-          <w:sz w:val="24"/>
-          <w:szCs w:val="24"/>
-        </w:rPr>
-      </w:pPr>
-      <w:r>
-        <w:rPr>
-          <w:sz w:val="24"/>
-          <w:szCs w:val="24"/>
-        </w:rPr>
-        <w:t>## Function: write_sales_to_file</w:t>
-      </w:r>
-    </w:p>
-    <w:p>
-      <w:pPr>
-        <w:rPr>
-          <w:sz w:val="24"/>
-          <w:szCs w:val="24"/>
-        </w:rPr>
-      </w:pPr>
-      <w:r>
-        <w:rPr>
-          <w:sz w:val="24"/>
-          <w:szCs w:val="24"/>
-        </w:rPr>
-        <w:t>Writes a list of sales amounts to a text file.</w:t>
-      </w:r>
-    </w:p>
-    <w:p>
-      <w:pPr>
-        <w:rPr>
-          <w:sz w:val="24"/>
-          <w:szCs w:val="24"/>
-        </w:rPr>
-      </w:pPr>
-    </w:p>
-    <w:p>
-      <w:pPr>
-        <w:rPr>
-          <w:sz w:val="24"/>
-          <w:szCs w:val="24"/>
-        </w:rPr>
-      </w:pPr>
-      <w:r>
-        <w:rPr>
-          <w:sz w:val="24"/>
-          <w:szCs w:val="24"/>
-        </w:rPr>
-        <w:t>Parameters:</w:t>
-      </w:r>
-    </w:p>
-    <w:p>
-      <w:pPr>
-        <w:rPr>
-          <w:sz w:val="24"/>
-          <w:szCs w:val="24"/>
-        </w:rPr>
-      </w:pPr>
-      <w:r>
-        <w:rPr>
-          <w:sz w:val="24"/>
-          <w:szCs w:val="24"/>
-        </w:rPr>
-        <w:t xml:space="preserve">    sales (list of float): A list containing individual sales amounts.</w:t>
-      </w:r>
-    </w:p>
-    <w:p>
-      <w:pPr>
-        <w:rPr>
-          <w:sz w:val="24"/>
-          <w:szCs w:val="24"/>
-        </w:rPr>
-      </w:pPr>
-      <w:r>
-        <w:rPr>
-          <w:sz w:val="24"/>
-          <w:szCs w:val="24"/>
-        </w:rPr>
-        <w:t xml:space="preserve">    filename (str): The name of the file where sales will be written.</w:t>
-      </w:r>
-    </w:p>
-    <w:p>
-      <w:pPr>
-        <w:rPr>
-          <w:sz w:val="24"/>
-          <w:szCs w:val="24"/>
-        </w:rPr>
-      </w:pPr>
-    </w:p>
-    <w:p>
-      <w:pPr>
-        <w:rPr>
-          <w:sz w:val="24"/>
-          <w:szCs w:val="24"/>
-        </w:rPr>
-      </w:pPr>
-      <w:r>
-        <w:rPr>
-          <w:sz w:val="24"/>
-          <w:szCs w:val="24"/>
-        </w:rPr>
-        <w:t>Variables:</w:t>
-      </w:r>
-    </w:p>
-    <w:p>
-      <w:pPr>
-        <w:rPr>
-          <w:sz w:val="24"/>
-          <w:szCs w:val="24"/>
-        </w:rPr>
-      </w:pPr>
-      <w:r>
-        <w:rPr>
-          <w:sz w:val="24"/>
-          <w:szCs w:val="24"/>
-        </w:rPr>
-        <w:t xml:space="preserve">    file (TextIO): File object used to write data to the file.</w:t>
-      </w:r>
-    </w:p>
-    <w:p>
-      <w:pPr>
-        <w:rPr>
-          <w:sz w:val="24"/>
-          <w:szCs w:val="24"/>
-        </w:rPr>
-      </w:pPr>
-      <w:r>
-        <w:rPr>
-          <w:sz w:val="24"/>
-          <w:szCs w:val="24"/>
-        </w:rPr>
-        <w:t xml:space="preserve">    sale (float): Individual sales amount from the sales list.</w:t>
-      </w:r>
-    </w:p>
-    <w:p>
-      <w:pPr>
-        <w:rPr>
-          <w:sz w:val="24"/>
-          <w:szCs w:val="24"/>
-        </w:rPr>
-      </w:pPr>
-    </w:p>
-    <w:p>
-      <w:pPr>
-        <w:rPr>
-          <w:sz w:val="24"/>
-          <w:szCs w:val="24"/>
-        </w:rPr>
-      </w:pPr>
-      <w:r>
-        <w:rPr>
-          <w:sz w:val="24"/>
-          <w:szCs w:val="24"/>
-        </w:rPr>
-        <w:t>Logic:</w:t>
-      </w:r>
-    </w:p>
-    <w:p>
-      <w:pPr>
-        <w:numPr>
-          <w:ilvl w:val="0"/>
-          <w:numId w:val="9"/>
-        </w:numPr>
-        <w:rPr>
-          <w:sz w:val="24"/>
-          <w:szCs w:val="24"/>
-        </w:rPr>
-      </w:pPr>
-      <w:r>
-        <w:rPr>
-          <w:sz w:val="24"/>
-          <w:szCs w:val="24"/>
-        </w:rPr>
-        <w:lastRenderedPageBreak/>
-        <w:t>Open the file in write mode.</w:t>
-      </w:r>
-    </w:p>
-    <w:p>
-      <w:pPr>
-        <w:numPr>
-          <w:ilvl w:val="0"/>
-          <w:numId w:val="9"/>
-        </w:numPr>
-        <w:rPr>
-          <w:sz w:val="24"/>
-          <w:szCs w:val="24"/>
-        </w:rPr>
-      </w:pPr>
-      <w:r>
-        <w:rPr>
-          <w:sz w:val="24"/>
-          <w:szCs w:val="24"/>
-        </w:rPr>
-        <w:t>Loop through the sales list.</w:t>
-      </w:r>
-    </w:p>
-    <w:p>
-      <w:pPr>
-        <w:numPr>
-          <w:ilvl w:val="0"/>
-          <w:numId w:val="9"/>
-        </w:numPr>
-        <w:rPr>
-          <w:sz w:val="24"/>
-          <w:szCs w:val="24"/>
-        </w:rPr>
-      </w:pPr>
-      <w:r>
-        <w:rPr>
-          <w:sz w:val="24"/>
-          <w:szCs w:val="24"/>
-        </w:rPr>
-        <w:t>Write each sale amount to the file on a new line.</w:t>
-      </w:r>
-    </w:p>
-    <w:p>
-      <w:pPr>
-        <w:numPr>
-          <w:ilvl w:val="0"/>
-          <w:numId w:val="9"/>
-        </w:numPr>
-        <w:rPr>
-          <w:sz w:val="24"/>
-          <w:szCs w:val="24"/>
-        </w:rPr>
-      </w:pPr>
-      <w:r>
-        <w:rPr>
-          <w:sz w:val="24"/>
-          <w:szCs w:val="24"/>
-        </w:rPr>
-        <w:t>Close the file automatically using a context manager.</w:t>
-      </w:r>
-    </w:p>
-    <w:p>
-      <w:pPr>
-        <w:rPr>
-          <w:sz w:val="24"/>
-          <w:szCs w:val="24"/>
-        </w:rPr>
-      </w:pPr>
-    </w:p>
-    <w:p>
-      <w:pPr>
-        <w:rPr>
-          <w:sz w:val="24"/>
-          <w:szCs w:val="24"/>
-        </w:rPr>
-      </w:pPr>
-      <w:r>
-        <w:rPr>
-          <w:sz w:val="24"/>
-          <w:szCs w:val="24"/>
-        </w:rPr>
-        <w:t>Return:</w:t>
-      </w:r>
-    </w:p>
-    <w:p>
-      <w:pPr>
-        <w:rPr>
-          <w:sz w:val="24"/>
-          <w:szCs w:val="24"/>
-        </w:rPr>
-      </w:pPr>
-      <w:r>
-        <w:rPr>
-          <w:sz w:val="24"/>
-          <w:szCs w:val="24"/>
-        </w:rPr>
-        <w:t xml:space="preserve">    None</w:t>
-      </w:r>
-    </w:p>
-    <w:p>
-      <w:pPr>
-        <w:rPr>
-          <w:sz w:val="24"/>
-          <w:szCs w:val="24"/>
-        </w:rPr>
-      </w:pPr>
-    </w:p>
-    <w:p>
-      <w:pPr>
+        <w:spacing w:after="0"/>
+        <w:rPr>
+          <w:sz w:val="24"/>
+          <w:szCs w:val="24"/>
+        </w:rPr>
+      </w:pPr>
+      <w:r>
+        <w:rPr>
+          <w:sz w:val="24"/>
+          <w:szCs w:val="24"/>
+        </w:rPr>
+        <w:t>Tuple (int, bool): Returns the updated ticket balance and a success flag</w:t>
+      </w:r>
+      <w:r>
+        <w:rPr>
+          <w:sz w:val="24"/>
+          <w:szCs w:val="24"/>
+        </w:rPr>
+        <w:t>.</w:t>
+      </w:r>
+    </w:p>
+    <w:p>
+      <w:pPr>
+        <w:spacing w:after="0"/>
+        <w:rPr>
+          <w:sz w:val="24"/>
+          <w:szCs w:val="24"/>
+        </w:rPr>
+      </w:pPr>
+    </w:p>
+    <w:p>
+      <w:pPr>
+        <w:spacing w:after="0"/>
         <w:rPr>
           <w:sz w:val="24"/>
           <w:szCs w:val="24"/>
@@ -952,12 +738,22 @@
         </w:rPr>
         <w:t xml:space="preserve"> repository: </w:t>
       </w:r>
-      <w:r>
-        <w:rPr>
-          <w:sz w:val="24"/>
-          <w:szCs w:val="24"/>
-        </w:rPr>
-        <w:t>https://github.com/nlawonn?tab=repositories</w:t>
+      <w:hyperlink r:id="rId6" w:history="1">
+        <w:r>
+          <w:rPr>
+            <w:rStyle w:val="Hyperlink"/>
+            <w:sz w:val="24"/>
+            <w:szCs w:val="24"/>
+          </w:rPr>
+          <w:t>https://github.com/nlawonn/ProgrammingConcepts2</w:t>
+        </w:r>
+      </w:hyperlink>
+      <w:r>
+        <w:rPr>
+          <w:sz w:val="24"/>
+          <w:szCs w:val="24"/>
+        </w:rPr>
+        <w:t xml:space="preserve"> </w:t>
       </w:r>
     </w:p>
     <w:p>
@@ -988,6 +784,7 @@
       </w:pPr>
       <w:r>
         <w:rPr>
+          <w:noProof/>
           <w:sz w:val="24"/>
           <w:szCs w:val="24"/>
         </w:rPr>
@@ -1007,7 +804,7 @@
                     <pic:cNvPicPr/>
                   </pic:nvPicPr>
                   <pic:blipFill>
-                    <a:blip r:embed="rId5"/>
+                    <a:blip r:embed="rId7"/>
                     <a:stretch>
                       <a:fillRect/>
                     </a:stretch>
@@ -1190,6 +987,95 @@
     </w:lvl>
   </w:abstractNum>
   <w:abstractNum w:abstractNumId="2" w15:restartNumberingAfterBreak="0">
+    <w:nsid w:val="16BC4CB0"/>
+    <w:multiLevelType w:val="hybridMultilevel"/>
+    <w:tmpl w:val="E196BBF4"/>
+    <w:lvl w:ilvl="0" w:tplc="0409000F">
+      <w:start w:val="1"/>
+      <w:numFmt w:val="decimal"/>
+      <w:lvlText w:val="%1."/>
+      <w:lvlJc w:val="left"/>
+      <w:pPr>
+        <w:ind w:left="720" w:hanging="360"/>
+      </w:pPr>
+      <w:rPr>
+        <w:rFonts w:hint="default"/>
+      </w:rPr>
+    </w:lvl>
+    <w:lvl w:ilvl="1" w:tplc="04090019" w:tentative="1">
+      <w:start w:val="1"/>
+      <w:numFmt w:val="lowerLetter"/>
+      <w:lvlText w:val="%2."/>
+      <w:lvlJc w:val="left"/>
+      <w:pPr>
+        <w:ind w:left="1440" w:hanging="360"/>
+      </w:pPr>
+    </w:lvl>
+    <w:lvl w:ilvl="2" w:tplc="0409001B" w:tentative="1">
+      <w:start w:val="1"/>
+      <w:numFmt w:val="lowerRoman"/>
+      <w:lvlText w:val="%3."/>
+      <w:lvlJc w:val="right"/>
+      <w:pPr>
+        <w:ind w:left="2160" w:hanging="180"/>
+      </w:pPr>
+    </w:lvl>
+    <w:lvl w:ilvl="3" w:tplc="0409000F" w:tentative="1">
+      <w:start w:val="1"/>
+      <w:numFmt w:val="decimal"/>
+      <w:lvlText w:val="%4."/>
+      <w:lvlJc w:val="left"/>
+      <w:pPr>
+        <w:ind w:left="2880" w:hanging="360"/>
+      </w:pPr>
+    </w:lvl>
+    <w:lvl w:ilvl="4" w:tplc="04090019" w:tentative="1">
+      <w:start w:val="1"/>
+      <w:numFmt w:val="lowerLetter"/>
+      <w:lvlText w:val="%5."/>
+      <w:lvlJc w:val="left"/>
+      <w:pPr>
+        <w:ind w:left="3600" w:hanging="360"/>
+      </w:pPr>
+    </w:lvl>
+    <w:lvl w:ilvl="5" w:tplc="0409001B" w:tentative="1">
+      <w:start w:val="1"/>
+      <w:numFmt w:val="lowerRoman"/>
+      <w:lvlText w:val="%6."/>
+      <w:lvlJc w:val="right"/>
+      <w:pPr>
+        <w:ind w:left="4320" w:hanging="180"/>
+      </w:pPr>
+    </w:lvl>
+    <w:lvl w:ilvl="6" w:tplc="0409000F" w:tentative="1">
+      <w:start w:val="1"/>
+      <w:numFmt w:val="decimal"/>
+      <w:lvlText w:val="%7."/>
+      <w:lvlJc w:val="left"/>
+      <w:pPr>
+        <w:ind w:left="5040" w:hanging="360"/>
+      </w:pPr>
+    </w:lvl>
+    <w:lvl w:ilvl="7" w:tplc="04090019" w:tentative="1">
+      <w:start w:val="1"/>
+      <w:numFmt w:val="lowerLetter"/>
+      <w:lvlText w:val="%8."/>
+      <w:lvlJc w:val="left"/>
+      <w:pPr>
+        <w:ind w:left="5760" w:hanging="360"/>
+      </w:pPr>
+    </w:lvl>
+    <w:lvl w:ilvl="8" w:tplc="0409001B" w:tentative="1">
+      <w:start w:val="1"/>
+      <w:numFmt w:val="lowerRoman"/>
+      <w:lvlText w:val="%9."/>
+      <w:lvlJc w:val="right"/>
+      <w:pPr>
+        <w:ind w:left="6480" w:hanging="180"/>
+      </w:pPr>
+    </w:lvl>
+  </w:abstractNum>
+  <w:abstractNum w:abstractNumId="3" w15:restartNumberingAfterBreak="0">
     <w:nsid w:val="21F2786B"/>
     <w:multiLevelType w:val="multilevel"/>
     <w:tmpl w:val="0BDEBD7E"/>
@@ -1240,7 +1126,7 @@
       <w:lvlJc w:val="left"/>
     </w:lvl>
   </w:abstractNum>
-  <w:abstractNum w:abstractNumId="3" w15:restartNumberingAfterBreak="0">
+  <w:abstractNum w:abstractNumId="4" w15:restartNumberingAfterBreak="0">
     <w:nsid w:val="3E75488E"/>
     <w:multiLevelType w:val="hybridMultilevel"/>
     <w:tmpl w:val="43C8D53E"/>
@@ -1329,7 +1215,7 @@
       </w:pPr>
     </w:lvl>
   </w:abstractNum>
-  <w:abstractNum w:abstractNumId="4" w15:restartNumberingAfterBreak="0">
+  <w:abstractNum w:abstractNumId="5" w15:restartNumberingAfterBreak="0">
     <w:nsid w:val="47CA5E0E"/>
     <w:multiLevelType w:val="multilevel"/>
     <w:tmpl w:val="F4EE1340"/>
@@ -1380,7 +1266,7 @@
       <w:lvlJc w:val="left"/>
     </w:lvl>
   </w:abstractNum>
-  <w:abstractNum w:abstractNumId="5" w15:restartNumberingAfterBreak="0">
+  <w:abstractNum w:abstractNumId="6" w15:restartNumberingAfterBreak="0">
     <w:nsid w:val="4B4B5297"/>
     <w:multiLevelType w:val="hybridMultilevel"/>
     <w:tmpl w:val="731EB5A8"/>
@@ -1469,7 +1355,7 @@
       </w:pPr>
     </w:lvl>
   </w:abstractNum>
-  <w:abstractNum w:abstractNumId="6" w15:restartNumberingAfterBreak="0">
+  <w:abstractNum w:abstractNumId="7" w15:restartNumberingAfterBreak="0">
     <w:nsid w:val="5CA73327"/>
     <w:multiLevelType w:val="hybridMultilevel"/>
     <w:tmpl w:val="8B14050A"/>
@@ -1558,7 +1444,7 @@
       </w:pPr>
     </w:lvl>
   </w:abstractNum>
-  <w:abstractNum w:abstractNumId="7" w15:restartNumberingAfterBreak="0">
+  <w:abstractNum w:abstractNumId="8" w15:restartNumberingAfterBreak="0">
     <w:nsid w:val="65A367F6"/>
     <w:multiLevelType w:val="hybridMultilevel"/>
     <w:tmpl w:val="BF000BAA"/>
@@ -1647,7 +1533,96 @@
       </w:pPr>
     </w:lvl>
   </w:abstractNum>
-  <w:abstractNum w:abstractNumId="8" w15:restartNumberingAfterBreak="0">
+  <w:abstractNum w:abstractNumId="9" w15:restartNumberingAfterBreak="0">
+    <w:nsid w:val="65B519E1"/>
+    <w:multiLevelType w:val="hybridMultilevel"/>
+    <w:tmpl w:val="2E3AF448"/>
+    <w:lvl w:ilvl="0" w:tplc="0409000F">
+      <w:start w:val="1"/>
+      <w:numFmt w:val="decimal"/>
+      <w:lvlText w:val="%1."/>
+      <w:lvlJc w:val="left"/>
+      <w:pPr>
+        <w:ind w:left="720" w:hanging="360"/>
+      </w:pPr>
+      <w:rPr>
+        <w:rFonts w:hint="default"/>
+      </w:rPr>
+    </w:lvl>
+    <w:lvl w:ilvl="1" w:tplc="04090019" w:tentative="1">
+      <w:start w:val="1"/>
+      <w:numFmt w:val="lowerLetter"/>
+      <w:lvlText w:val="%2."/>
+      <w:lvlJc w:val="left"/>
+      <w:pPr>
+        <w:ind w:left="1440" w:hanging="360"/>
+      </w:pPr>
+    </w:lvl>
+    <w:lvl w:ilvl="2" w:tplc="0409001B" w:tentative="1">
+      <w:start w:val="1"/>
+      <w:numFmt w:val="lowerRoman"/>
+      <w:lvlText w:val="%3."/>
+      <w:lvlJc w:val="right"/>
+      <w:pPr>
+        <w:ind w:left="2160" w:hanging="180"/>
+      </w:pPr>
+    </w:lvl>
+    <w:lvl w:ilvl="3" w:tplc="0409000F" w:tentative="1">
+      <w:start w:val="1"/>
+      <w:numFmt w:val="decimal"/>
+      <w:lvlText w:val="%4."/>
+      <w:lvlJc w:val="left"/>
+      <w:pPr>
+        <w:ind w:left="2880" w:hanging="360"/>
+      </w:pPr>
+    </w:lvl>
+    <w:lvl w:ilvl="4" w:tplc="04090019" w:tentative="1">
+      <w:start w:val="1"/>
+      <w:numFmt w:val="lowerLetter"/>
+      <w:lvlText w:val="%5."/>
+      <w:lvlJc w:val="left"/>
+      <w:pPr>
+        <w:ind w:left="3600" w:hanging="360"/>
+      </w:pPr>
+    </w:lvl>
+    <w:lvl w:ilvl="5" w:tplc="0409001B" w:tentative="1">
+      <w:start w:val="1"/>
+      <w:numFmt w:val="lowerRoman"/>
+      <w:lvlText w:val="%6."/>
+      <w:lvlJc w:val="right"/>
+      <w:pPr>
+        <w:ind w:left="4320" w:hanging="180"/>
+      </w:pPr>
+    </w:lvl>
+    <w:lvl w:ilvl="6" w:tplc="0409000F" w:tentative="1">
+      <w:start w:val="1"/>
+      <w:numFmt w:val="decimal"/>
+      <w:lvlText w:val="%7."/>
+      <w:lvlJc w:val="left"/>
+      <w:pPr>
+        <w:ind w:left="5040" w:hanging="360"/>
+      </w:pPr>
+    </w:lvl>
+    <w:lvl w:ilvl="7" w:tplc="04090019" w:tentative="1">
+      <w:start w:val="1"/>
+      <w:numFmt w:val="lowerLetter"/>
+      <w:lvlText w:val="%8."/>
+      <w:lvlJc w:val="left"/>
+      <w:pPr>
+        <w:ind w:left="5760" w:hanging="360"/>
+      </w:pPr>
+    </w:lvl>
+    <w:lvl w:ilvl="8" w:tplc="0409001B" w:tentative="1">
+      <w:start w:val="1"/>
+      <w:numFmt w:val="lowerRoman"/>
+      <w:lvlText w:val="%9."/>
+      <w:lvlJc w:val="right"/>
+      <w:pPr>
+        <w:ind w:left="6480" w:hanging="180"/>
+      </w:pPr>
+    </w:lvl>
+  </w:abstractNum>
+  <w:abstractNum w:abstractNumId="10" w15:restartNumberingAfterBreak="0">
     <w:nsid w:val="6A016E5E"/>
     <w:multiLevelType w:val="hybridMultilevel"/>
     <w:tmpl w:val="731EB5A8"/>
@@ -1736,7 +1711,7 @@
       </w:pPr>
     </w:lvl>
   </w:abstractNum>
-  <w:abstractNum w:abstractNumId="9" w15:restartNumberingAfterBreak="0">
+  <w:abstractNum w:abstractNumId="11" w15:restartNumberingAfterBreak="0">
     <w:nsid w:val="7EE7468C"/>
     <w:multiLevelType w:val="hybridMultilevel"/>
     <w:tmpl w:val="8B14050A"/>
@@ -1826,34 +1801,40 @@
     </w:lvl>
   </w:abstractNum>
   <w:num w:numId="1" w16cid:durableId="766117505">
-    <w:abstractNumId w:val="5"/>
+    <w:abstractNumId w:val="6"/>
   </w:num>
   <w:num w:numId="2" w16cid:durableId="1076628437">
-    <w:abstractNumId w:val="3"/>
+    <w:abstractNumId w:val="4"/>
   </w:num>
   <w:num w:numId="3" w16cid:durableId="1906527172">
     <w:abstractNumId w:val="1"/>
   </w:num>
   <w:num w:numId="4" w16cid:durableId="1769158214">
-    <w:abstractNumId w:val="9"/>
+    <w:abstractNumId w:val="11"/>
   </w:num>
   <w:num w:numId="5" w16cid:durableId="1773816028">
-    <w:abstractNumId w:val="8"/>
+    <w:abstractNumId w:val="10"/>
   </w:num>
   <w:num w:numId="6" w16cid:durableId="247621874">
-    <w:abstractNumId w:val="6"/>
+    <w:abstractNumId w:val="7"/>
   </w:num>
   <w:num w:numId="7" w16cid:durableId="8530888">
-    <w:abstractNumId w:val="7"/>
+    <w:abstractNumId w:val="8"/>
   </w:num>
   <w:num w:numId="8" w16cid:durableId="1878541754">
     <w:abstractNumId w:val="0"/>
   </w:num>
   <w:num w:numId="9" w16cid:durableId="797770267">
+    <w:abstractNumId w:val="3"/>
+  </w:num>
+  <w:num w:numId="10" w16cid:durableId="793907082">
+    <w:abstractNumId w:val="5"/>
+  </w:num>
+  <w:num w:numId="11" w16cid:durableId="986740336">
     <w:abstractNumId w:val="2"/>
   </w:num>
-  <w:num w:numId="10" w16cid:durableId="793907082">
-    <w:abstractNumId w:val="4"/>
+  <w:num w:numId="12" w16cid:durableId="743987773">
+    <w:abstractNumId w:val="9"/>
   </w:num>
 </w:numbering>
 </file>
@@ -2798,6 +2779,18 @@
       <w:shd w:val="clear" w:color="auto" w:fill="E1DFDD"/>
     </w:rPr>
   </w:style>
+  <w:style w:type="character" w:styleId="FollowedHyperlink">
+    <w:name w:val="FollowedHyperlink"/>
+    <w:basedOn w:val="DefaultParagraphFont"/>
+    <w:uiPriority w:val="99"/>
+    <w:semiHidden/>
+    <w:unhideWhenUsed/>
+    <w:rsid w:val="00F146A8"/>
+    <w:rPr>
+      <w:color w:val="96607D" w:themeColor="followedHyperlink"/>
+      <w:u w:val="single"/>
+    </w:rPr>
+  </w:style>
 </w:styles>
 </file>
 
@@ -3094,4 +3087,16 @@
     </a:ext>
   </a:extLst>
 </a:theme>
+</file>
+
+<file path=customXml/item1.xml><?xml version="1.0" encoding="utf-8"?>
+<b:Sources xmlns:b="http://schemas.openxmlformats.org/officeDocument/2006/bibliography" xmlns="http://schemas.openxmlformats.org/officeDocument/2006/bibliography" SelectedStyle="\APASixthEditionOfficeOnline.xsl" StyleName="APA" Version="6"/>
+</file>
+
+<file path=customXml/itemProps1.xml><?xml version="1.0" encoding="utf-8"?>
+<ds:datastoreItem xmlns:ds="http://schemas.openxmlformats.org/officeDocument/2006/customXml" ds:itemID="{9BD9FD1F-EDB7-44F8-BC6E-E6ED06395F88}">
+  <ds:schemaRefs>
+    <ds:schemaRef ds:uri="http://schemas.openxmlformats.org/officeDocument/2006/bibliography"/>
+  </ds:schemaRefs>
+</ds:datastoreItem>
 </file>
</xml_diff>